<commit_message>
snapshot: commit working folder for cross-PC sync
</commit_message>
<xml_diff>
--- a/תכולת דשבורד הישגיות.docx
+++ b/תכולת דשבורד הישגיות.docx
@@ -870,7 +870,7 @@
                 <w:sz w:val="22"/>
                 <w:szCs w:val="22"/>
               </w:rPr>
-              <w:t xml:space="preserve">5</w:t>
+              <w:t xml:space="preserve">6</w:t>
             </w:r>
           </w:p>
         </w:tc>
@@ -1081,7 +1081,7 @@
                 <w:sz w:val="22"/>
                 <w:szCs w:val="22"/>
               </w:rPr>
-              <w:t xml:space="preserve">5</w:t>
+              <w:t xml:space="preserve">6</w:t>
             </w:r>
           </w:p>
         </w:tc>

</xml_diff>